<commit_message>
Add slides 17-18 + Word update: SMB one-man-op target + weekly updates
Slide 17: Attack targets one-person operations where the owner has
full approval authority and no one to consult. All defense points
vanish with no colleagues, no IT staff, no separate approver.

Slide 18: Attackers run weekly PDCA on scripts. Awareness campaigns
take weeks/months to ship while scripts evolve every 7 days. Only
technical controls are scenario-independent.

https://claude.ai/code/session_01F7t8LKifK43o6sCdF2a3gQ
</commit_message>
<xml_diff>
--- a/Fraud_Kill_Chain.docx
+++ b/Fraud_Kill_Chain.docx
@@ -2119,6 +2119,773 @@
       </w:r>
     </w:p>
     <w:p>
+      <w:pPr>
+        <w:pStyle w:val="Heading2"/>
+      </w:pPr>
+      <w:r>
+        <w:rPr>
+          <w:rFonts w:ascii="Meiryo" w:hAnsi="Meiryo"/>
+        </w:rPr>
+        <w:t>6. 真のターゲット：ワンオペの零細企業</w:t>
+      </w:r>
+    </w:p>
+    <w:p>
+      <w:r>
+        <w:rPr>
+          <w:rFonts w:ascii="Meiryo" w:hAnsi="Meiryo"/>
+          <w:b/>
+          <w:sz w:val="20"/>
+        </w:rPr>
+        <w:t>手順①の自動音声「承認実行権限を持っている方は1を」は、作成・承認・実行が全部できるワンオペの社長を狙い撃ちしている。</w:t>
+      </w:r>
+    </w:p>
+    <w:p>
+      <w:pPr>
+        <w:pStyle w:val="Heading3"/>
+      </w:pPr>
+      <w:r>
+        <w:rPr>
+          <w:rFonts w:ascii="Meiryo" w:hAnsi="Meiryo"/>
+        </w:rPr>
+        <w:t>企業規模別の送金フロー</w:t>
+      </w:r>
+    </w:p>
+    <w:tbl>
+      <w:tblPr>
+        <w:tblStyle w:val="TableGrid"/>
+        <w:tblW w:type="auto" w:w="0"/>
+        <w:tblLook w:firstColumn="1" w:firstRow="1" w:lastColumn="0" w:lastRow="0" w:noHBand="0" w:noVBand="1" w:val="04A0"/>
+      </w:tblPr>
+      <w:tblGrid>
+        <w:gridCol w:w="2268"/>
+        <w:gridCol w:w="2268"/>
+        <w:gridCol w:w="2268"/>
+        <w:gridCol w:w="2268"/>
+      </w:tblGrid>
+      <w:tr>
+        <w:tc>
+          <w:tcPr>
+            <w:tcW w:type="dxa" w:w="2268"/>
+            <w:shd w:fill="222222" w:val="clear"/>
+          </w:tcPr>
+          <w:p>
+            <w:r>
+              <w:rPr>
+                <w:rFonts w:ascii="Meiryo" w:hAnsi="Meiryo"/>
+                <w:b/>
+                <w:color w:val="FFFFFF"/>
+                <w:sz w:val="16"/>
+              </w:rPr>
+              <w:t>企業規模</w:t>
+            </w:r>
+          </w:p>
+        </w:tc>
+        <w:tc>
+          <w:tcPr>
+            <w:tcW w:type="dxa" w:w="2268"/>
+            <w:shd w:fill="222222" w:val="clear"/>
+          </w:tcPr>
+          <w:p>
+            <w:r>
+              <w:rPr>
+                <w:rFonts w:ascii="Meiryo" w:hAnsi="Meiryo"/>
+                <w:b/>
+                <w:color w:val="FFFFFF"/>
+                <w:sz w:val="16"/>
+              </w:rPr>
+              <w:t>送金フロー</w:t>
+            </w:r>
+          </w:p>
+        </w:tc>
+        <w:tc>
+          <w:tcPr>
+            <w:tcW w:type="dxa" w:w="2268"/>
+            <w:shd w:fill="222222" w:val="clear"/>
+          </w:tcPr>
+          <w:p>
+            <w:r>
+              <w:rPr>
+                <w:rFonts w:ascii="Meiryo" w:hAnsi="Meiryo"/>
+                <w:b/>
+                <w:color w:val="FFFFFF"/>
+                <w:sz w:val="16"/>
+              </w:rPr>
+              <w:t>関与人数</w:t>
+            </w:r>
+          </w:p>
+        </w:tc>
+        <w:tc>
+          <w:tcPr>
+            <w:tcW w:type="dxa" w:w="2268"/>
+            <w:shd w:fill="222222" w:val="clear"/>
+          </w:tcPr>
+          <w:p>
+            <w:r>
+              <w:rPr>
+                <w:rFonts w:ascii="Meiryo" w:hAnsi="Meiryo"/>
+                <w:b/>
+                <w:color w:val="FFFFFF"/>
+                <w:sz w:val="16"/>
+              </w:rPr>
+              <w:t>チェック機能</w:t>
+            </w:r>
+          </w:p>
+        </w:tc>
+      </w:tr>
+      <w:tr>
+        <w:tc>
+          <w:tcPr>
+            <w:tcW w:type="dxa" w:w="2268"/>
+          </w:tcPr>
+          <w:p>
+            <w:r/>
+            <w:r>
+              <w:rPr>
+                <w:rFonts w:ascii="Meiryo" w:hAnsi="Meiryo"/>
+                <w:b w:val="0"/>
+                <w:sz w:val="18"/>
+              </w:rPr>
+              <w:t>大企業</w:t>
+            </w:r>
+          </w:p>
+        </w:tc>
+        <w:tc>
+          <w:tcPr>
+            <w:tcW w:type="dxa" w:w="2268"/>
+          </w:tcPr>
+          <w:p>
+            <w:r/>
+            <w:r>
+              <w:rPr>
+                <w:rFonts w:ascii="Meiryo" w:hAnsi="Meiryo"/>
+                <w:b w:val="0"/>
+                <w:sz w:val="18"/>
+              </w:rPr>
+              <w:t>担当者作成→上長承認→別の承認者実行</w:t>
+            </w:r>
+          </w:p>
+        </w:tc>
+        <w:tc>
+          <w:tcPr>
+            <w:tcW w:type="dxa" w:w="2268"/>
+          </w:tcPr>
+          <w:p>
+            <w:r/>
+            <w:r>
+              <w:rPr>
+                <w:rFonts w:ascii="Meiryo" w:hAnsi="Meiryo"/>
+                <w:b w:val="0"/>
+                <w:sz w:val="18"/>
+              </w:rPr>
+              <w:t>3人</w:t>
+            </w:r>
+          </w:p>
+        </w:tc>
+        <w:tc>
+          <w:tcPr>
+            <w:tcW w:type="dxa" w:w="2268"/>
+          </w:tcPr>
+          <w:p>
+            <w:r/>
+            <w:r>
+              <w:rPr>
+                <w:rFonts w:ascii="Meiryo" w:hAnsi="Meiryo"/>
+                <w:b w:val="0"/>
+                <w:sz w:val="18"/>
+              </w:rPr>
+              <w:t>1人が騙されても止まる</w:t>
+            </w:r>
+          </w:p>
+        </w:tc>
+      </w:tr>
+      <w:tr>
+        <w:tc>
+          <w:tcPr>
+            <w:tcW w:type="dxa" w:w="2268"/>
+          </w:tcPr>
+          <w:p>
+            <w:r/>
+            <w:r>
+              <w:rPr>
+                <w:rFonts w:ascii="Meiryo" w:hAnsi="Meiryo"/>
+                <w:b w:val="0"/>
+                <w:sz w:val="18"/>
+              </w:rPr>
+              <w:t>中小企業</w:t>
+            </w:r>
+          </w:p>
+        </w:tc>
+        <w:tc>
+          <w:tcPr>
+            <w:tcW w:type="dxa" w:w="2268"/>
+          </w:tcPr>
+          <w:p>
+            <w:r/>
+            <w:r>
+              <w:rPr>
+                <w:rFonts w:ascii="Meiryo" w:hAnsi="Meiryo"/>
+                <w:b w:val="0"/>
+                <w:sz w:val="18"/>
+              </w:rPr>
+              <w:t>担当者作成→上長承認</w:t>
+            </w:r>
+          </w:p>
+        </w:tc>
+        <w:tc>
+          <w:tcPr>
+            <w:tcW w:type="dxa" w:w="2268"/>
+          </w:tcPr>
+          <w:p>
+            <w:r/>
+            <w:r>
+              <w:rPr>
+                <w:rFonts w:ascii="Meiryo" w:hAnsi="Meiryo"/>
+                <w:b w:val="0"/>
+                <w:sz w:val="18"/>
+              </w:rPr>
+              <w:t>2人</w:t>
+            </w:r>
+          </w:p>
+        </w:tc>
+        <w:tc>
+          <w:tcPr>
+            <w:tcW w:type="dxa" w:w="2268"/>
+          </w:tcPr>
+          <w:p>
+            <w:r/>
+            <w:r>
+              <w:rPr>
+                <w:rFonts w:ascii="Meiryo" w:hAnsi="Meiryo"/>
+                <w:b w:val="0"/>
+                <w:sz w:val="18"/>
+              </w:rPr>
+              <w:t>まだチェック機能がある</w:t>
+            </w:r>
+          </w:p>
+        </w:tc>
+      </w:tr>
+      <w:tr>
+        <w:tc>
+          <w:tcPr>
+            <w:tcW w:type="dxa" w:w="2268"/>
+            <w:shd w:fill="FDEDEC" w:val="clear"/>
+          </w:tcPr>
+          <w:p>
+            <w:r/>
+            <w:r>
+              <w:rPr>
+                <w:rFonts w:ascii="Meiryo" w:hAnsi="Meiryo"/>
+                <w:b w:val="0"/>
+                <w:color w:val="C0392B"/>
+                <w:sz w:val="18"/>
+              </w:rPr>
+              <w:t>零細企業</w:t>
+            </w:r>
+          </w:p>
+        </w:tc>
+        <w:tc>
+          <w:tcPr>
+            <w:tcW w:type="dxa" w:w="2268"/>
+            <w:shd w:fill="FDEDEC" w:val="clear"/>
+          </w:tcPr>
+          <w:p>
+            <w:r/>
+            <w:r>
+              <w:rPr>
+                <w:rFonts w:ascii="Meiryo" w:hAnsi="Meiryo"/>
+                <w:b w:val="0"/>
+                <w:color w:val="C0392B"/>
+                <w:sz w:val="18"/>
+              </w:rPr>
+              <w:t>社長が作成→社長が承認→社長が実行</w:t>
+            </w:r>
+          </w:p>
+        </w:tc>
+        <w:tc>
+          <w:tcPr>
+            <w:tcW w:type="dxa" w:w="2268"/>
+            <w:shd w:fill="FDEDEC" w:val="clear"/>
+          </w:tcPr>
+          <w:p>
+            <w:r/>
+            <w:r>
+              <w:rPr>
+                <w:rFonts w:ascii="Meiryo" w:hAnsi="Meiryo"/>
+                <w:b w:val="0"/>
+                <w:color w:val="C0392B"/>
+                <w:sz w:val="18"/>
+              </w:rPr>
+              <w:t>1人（ワンオペ）</w:t>
+            </w:r>
+          </w:p>
+        </w:tc>
+        <w:tc>
+          <w:tcPr>
+            <w:tcW w:type="dxa" w:w="2268"/>
+            <w:shd w:fill="FDEDEC" w:val="clear"/>
+          </w:tcPr>
+          <w:p>
+            <w:r/>
+            <w:r>
+              <w:rPr>
+                <w:rFonts w:ascii="Meiryo" w:hAnsi="Meiryo"/>
+                <w:b w:val="0"/>
+                <w:color w:val="C0392B"/>
+                <w:sz w:val="18"/>
+              </w:rPr>
+              <w:t>チェック機能ゼロ</w:t>
+            </w:r>
+          </w:p>
+        </w:tc>
+      </w:tr>
+    </w:tbl>
+    <w:p>
+      <w:pPr>
+        <w:pStyle w:val="Heading3"/>
+      </w:pPr>
+      <w:r>
+        <w:rPr>
+          <w:rFonts w:ascii="Meiryo" w:hAnsi="Meiryo"/>
+        </w:rPr>
+        <w:t>ワンオペで消滅する防御ポイント</w:t>
+      </w:r>
+    </w:p>
+    <w:tbl>
+      <w:tblPr>
+        <w:tblStyle w:val="TableGrid"/>
+        <w:tblW w:type="auto" w:w="0"/>
+        <w:tblLook w:firstColumn="1" w:firstRow="1" w:lastColumn="0" w:lastRow="0" w:noHBand="0" w:noVBand="1" w:val="04A0"/>
+      </w:tblPr>
+      <w:tblGrid>
+        <w:gridCol w:w="3024"/>
+        <w:gridCol w:w="3024"/>
+        <w:gridCol w:w="3024"/>
+      </w:tblGrid>
+      <w:tr>
+        <w:tc>
+          <w:tcPr>
+            <w:tcW w:type="dxa" w:w="3024"/>
+            <w:shd w:fill="222222" w:val="clear"/>
+          </w:tcPr>
+          <w:p>
+            <w:r>
+              <w:rPr>
+                <w:rFonts w:ascii="Meiryo" w:hAnsi="Meiryo"/>
+                <w:b/>
+                <w:color w:val="FFFFFF"/>
+                <w:sz w:val="16"/>
+              </w:rPr>
+              <w:t>防御ポイント</w:t>
+            </w:r>
+          </w:p>
+        </w:tc>
+        <w:tc>
+          <w:tcPr>
+            <w:tcW w:type="dxa" w:w="3024"/>
+            <w:shd w:fill="222222" w:val="clear"/>
+          </w:tcPr>
+          <w:p>
+            <w:r>
+              <w:rPr>
+                <w:rFonts w:ascii="Meiryo" w:hAnsi="Meiryo"/>
+                <w:b/>
+                <w:color w:val="FFFFFF"/>
+                <w:sz w:val="16"/>
+              </w:rPr>
+              <w:t>複数人体制</w:t>
+            </w:r>
+          </w:p>
+        </w:tc>
+        <w:tc>
+          <w:tcPr>
+            <w:tcW w:type="dxa" w:w="3024"/>
+            <w:shd w:fill="222222" w:val="clear"/>
+          </w:tcPr>
+          <w:p>
+            <w:r>
+              <w:rPr>
+                <w:rFonts w:ascii="Meiryo" w:hAnsi="Meiryo"/>
+                <w:b/>
+                <w:color w:val="FFFFFF"/>
+                <w:sz w:val="16"/>
+              </w:rPr>
+              <w:t>ワンオペ</w:t>
+            </w:r>
+          </w:p>
+        </w:tc>
+      </w:tr>
+      <w:tr>
+        <w:tc>
+          <w:tcPr>
+            <w:tcW w:type="dxa" w:w="3024"/>
+          </w:tcPr>
+          <w:p>
+            <w:r/>
+            <w:r>
+              <w:rPr>
+                <w:rFonts w:ascii="Meiryo" w:hAnsi="Meiryo"/>
+                <w:b w:val="0"/>
+                <w:sz w:val="18"/>
+              </w:rPr>
+              <w:t>「メアド教えて」に違和感</w:t>
+            </w:r>
+          </w:p>
+        </w:tc>
+        <w:tc>
+          <w:tcPr>
+            <w:tcW w:type="dxa" w:w="3024"/>
+          </w:tcPr>
+          <w:p>
+            <w:r/>
+            <w:r>
+              <w:rPr>
+                <w:rFonts w:ascii="Meiryo" w:hAnsi="Meiryo"/>
+                <w:b w:val="0"/>
+                <w:sz w:val="18"/>
+              </w:rPr>
+              <w:t>同僚に相談できる</w:t>
+            </w:r>
+          </w:p>
+        </w:tc>
+        <w:tc>
+          <w:tcPr>
+            <w:tcW w:type="dxa" w:w="3024"/>
+          </w:tcPr>
+          <w:p>
+            <w:r/>
+            <w:r>
+              <w:rPr>
+                <w:rFonts w:ascii="Meiryo" w:hAnsi="Meiryo"/>
+                <w:b w:val="0"/>
+                <w:sz w:val="18"/>
+              </w:rPr>
+              <w:t>相談相手がいない</w:t>
+            </w:r>
+          </w:p>
+        </w:tc>
+      </w:tr>
+      <w:tr>
+        <w:tc>
+          <w:tcPr>
+            <w:tcW w:type="dxa" w:w="3024"/>
+          </w:tcPr>
+          <w:p>
+            <w:r/>
+            <w:r>
+              <w:rPr>
+                <w:rFonts w:ascii="Meiryo" w:hAnsi="Meiryo"/>
+                <w:b w:val="0"/>
+                <w:sz w:val="18"/>
+              </w:rPr>
+              <w:t>不明な発行元の警告</w:t>
+            </w:r>
+          </w:p>
+        </w:tc>
+        <w:tc>
+          <w:tcPr>
+            <w:tcW w:type="dxa" w:w="3024"/>
+          </w:tcPr>
+          <w:p>
+            <w:r/>
+            <w:r>
+              <w:rPr>
+                <w:rFonts w:ascii="Meiryo" w:hAnsi="Meiryo"/>
+                <w:b w:val="0"/>
+                <w:sz w:val="18"/>
+              </w:rPr>
+              <w:t>IT担当に確認できる</w:t>
+            </w:r>
+          </w:p>
+        </w:tc>
+        <w:tc>
+          <w:tcPr>
+            <w:tcW w:type="dxa" w:w="3024"/>
+          </w:tcPr>
+          <w:p>
+            <w:r/>
+            <w:r>
+              <w:rPr>
+                <w:rFonts w:ascii="Meiryo" w:hAnsi="Meiryo"/>
+                <w:b w:val="0"/>
+                <w:sz w:val="18"/>
+              </w:rPr>
+              <w:t>IT担当がいない</w:t>
+            </w:r>
+          </w:p>
+        </w:tc>
+      </w:tr>
+      <w:tr>
+        <w:tc>
+          <w:tcPr>
+            <w:tcW w:type="dxa" w:w="3024"/>
+          </w:tcPr>
+          <w:p>
+            <w:r/>
+            <w:r>
+              <w:rPr>
+                <w:rFonts w:ascii="Meiryo" w:hAnsi="Meiryo"/>
+                <w:b w:val="0"/>
+                <w:sz w:val="18"/>
+              </w:rPr>
+              <w:t>送金の承認</w:t>
+            </w:r>
+          </w:p>
+        </w:tc>
+        <w:tc>
+          <w:tcPr>
+            <w:tcW w:type="dxa" w:w="3024"/>
+          </w:tcPr>
+          <w:p>
+            <w:r/>
+            <w:r>
+              <w:rPr>
+                <w:rFonts w:ascii="Meiryo" w:hAnsi="Meiryo"/>
+                <w:b w:val="0"/>
+                <w:sz w:val="18"/>
+              </w:rPr>
+              <w:t>別の承認者が止める</w:t>
+            </w:r>
+          </w:p>
+        </w:tc>
+        <w:tc>
+          <w:tcPr>
+            <w:tcW w:type="dxa" w:w="3024"/>
+          </w:tcPr>
+          <w:p>
+            <w:r/>
+            <w:r>
+              <w:rPr>
+                <w:rFonts w:ascii="Meiryo" w:hAnsi="Meiryo"/>
+                <w:b w:val="0"/>
+                <w:sz w:val="18"/>
+              </w:rPr>
+              <w:t>自分で承認してしまう</w:t>
+            </w:r>
+          </w:p>
+        </w:tc>
+      </w:tr>
+      <w:tr>
+        <w:tc>
+          <w:tcPr>
+            <w:tcW w:type="dxa" w:w="3024"/>
+          </w:tcPr>
+          <w:p>
+            <w:r/>
+            <w:r>
+              <w:rPr>
+                <w:rFonts w:ascii="Meiryo" w:hAnsi="Meiryo"/>
+                <w:b w:val="0"/>
+                <w:sz w:val="18"/>
+              </w:rPr>
+              <w:t>電話中に確認</w:t>
+            </w:r>
+          </w:p>
+        </w:tc>
+        <w:tc>
+          <w:tcPr>
+            <w:tcW w:type="dxa" w:w="3024"/>
+          </w:tcPr>
+          <w:p>
+            <w:r/>
+            <w:r>
+              <w:rPr>
+                <w:rFonts w:ascii="Meiryo" w:hAnsi="Meiryo"/>
+                <w:b w:val="0"/>
+                <w:sz w:val="18"/>
+              </w:rPr>
+              <w:t>他の人が銀行に電話できる</w:t>
+            </w:r>
+          </w:p>
+        </w:tc>
+        <w:tc>
+          <w:tcPr>
+            <w:tcW w:type="dxa" w:w="3024"/>
+          </w:tcPr>
+          <w:p>
+            <w:r/>
+            <w:r>
+              <w:rPr>
+                <w:rFonts w:ascii="Meiryo" w:hAnsi="Meiryo"/>
+                <w:b w:val="0"/>
+                <w:sz w:val="18"/>
+              </w:rPr>
+              <w:t>自分しかいない</w:t>
+            </w:r>
+          </w:p>
+        </w:tc>
+      </w:tr>
+      <w:tr>
+        <w:tc>
+          <w:tcPr>
+            <w:tcW w:type="dxa" w:w="3024"/>
+          </w:tcPr>
+          <w:p>
+            <w:r/>
+            <w:r>
+              <w:rPr>
+                <w:rFonts w:ascii="Meiryo" w:hAnsi="Meiryo"/>
+                <w:b w:val="0"/>
+                <w:sz w:val="18"/>
+              </w:rPr>
+              <w:t>事後の発覚</w:t>
+            </w:r>
+          </w:p>
+        </w:tc>
+        <w:tc>
+          <w:tcPr>
+            <w:tcW w:type="dxa" w:w="3024"/>
+          </w:tcPr>
+          <w:p>
+            <w:r/>
+            <w:r>
+              <w:rPr>
+                <w:rFonts w:ascii="Meiryo" w:hAnsi="Meiryo"/>
+                <w:b w:val="0"/>
+                <w:sz w:val="18"/>
+              </w:rPr>
+              <w:t>経理が不審な送金に気づく</w:t>
+            </w:r>
+          </w:p>
+        </w:tc>
+        <w:tc>
+          <w:tcPr>
+            <w:tcW w:type="dxa" w:w="3024"/>
+          </w:tcPr>
+          <w:p>
+            <w:r/>
+            <w:r>
+              <w:rPr>
+                <w:rFonts w:ascii="Meiryo" w:hAnsi="Meiryo"/>
+                <w:b w:val="0"/>
+                <w:sz w:val="18"/>
+              </w:rPr>
+              <w:t>自分が経理</w:t>
+            </w:r>
+          </w:p>
+        </w:tc>
+      </w:tr>
+    </w:tbl>
+    <w:p>
+      <w:r>
+        <w:rPr>
+          <w:rFonts w:ascii="Meiryo" w:hAnsi="Meiryo"/>
+          <w:b/>
+          <w:color w:val="C0392B"/>
+          <w:sz w:val="20"/>
+        </w:rPr>
+        <w:t>零細企業は「セキュリティ体制なし＋ワンオペ＋相談相手なし＋承認チェックなし」— 犯人にとって最も効率の良いターゲット。</w:t>
+      </w:r>
+    </w:p>
+    <w:p>
+      <w:pPr>
+        <w:pStyle w:val="Heading2"/>
+      </w:pPr>
+      <w:r>
+        <w:rPr>
+          <w:rFonts w:ascii="Meiryo" w:hAnsi="Meiryo"/>
+        </w:rPr>
+        <w:t>7. 週次でシナリオ更新 — 注意喚起は構造的に追いつけない</w:t>
+      </w:r>
+    </w:p>
+    <w:p>
+      <w:r>
+        <w:rPr>
+          <w:rFonts w:ascii="Meiryo" w:hAnsi="Meiryo"/>
+          <w:b/>
+          <w:sz w:val="20"/>
+        </w:rPr>
+        <w:t>犯人は組織的にPDCAを回しており、週次でシナリオを改善している。</w:t>
+      </w:r>
+    </w:p>
+    <w:p>
+      <w:r>
+        <w:rPr>
+          <w:rFonts w:ascii="Meiryo" w:hAnsi="Meiryo"/>
+          <w:b w:val="0"/>
+          <w:sz w:val="18"/>
+        </w:rPr>
+        <w:t>• Plan：新しいシナリオを設計（先週の失敗を改善）</w:t>
+        <w:br/>
+        <w:t>• Do：大量架電で実行</w:t>
+        <w:br/>
+        <w:t>• Check：成功率・失敗ポイントを分析</w:t>
+        <w:br/>
+        <w:t>• Act：翌週シナリオを改善（破綻ポイントを潰す）</w:t>
+      </w:r>
+    </w:p>
+    <w:p>
+      <w:r>
+        <w:rPr>
+          <w:rFonts w:ascii="Meiryo" w:hAnsi="Meiryo"/>
+          <w:b w:val="0"/>
+          <w:sz w:val="18"/>
+        </w:rPr>
+        <w:t>改善例：「メアドを聞いたら怪しまれた」→翌週は別の聞き方に / 「不明な発行元で止まった」→翌週は証明書を用意 / 「迷惑フォルダで止まった」→翌週はトーク改善</w:t>
+      </w:r>
+    </w:p>
+    <w:p>
+      <w:pPr>
+        <w:pStyle w:val="Heading3"/>
+      </w:pPr>
+      <w:r>
+        <w:rPr>
+          <w:rFonts w:ascii="Meiryo" w:hAnsi="Meiryo"/>
+        </w:rPr>
+        <w:t>注意喚起 vs シナリオ更新のスピード</w:t>
+      </w:r>
+    </w:p>
+    <w:p>
+      <w:r>
+        <w:rPr>
+          <w:rFonts w:ascii="Meiryo" w:hAnsi="Meiryo"/>
+          <w:b w:val="0"/>
+          <w:sz w:val="18"/>
+        </w:rPr>
+        <w:t>銀行側：注意喚起を作成→社内審査→顧客に配信 → 数週間〜数ヶ月</w:t>
+        <w:br/>
+        <w:t>犯人側：先週の結果を分析→シナリオ修正→翌週実行 → 1週間</w:t>
+        <w:br/>
+        <w:t>→ 銀行が1つのパターンに対応する間に、犯人は4〜8回シナリオを更新している</w:t>
+      </w:r>
+    </w:p>
+    <w:p>
+      <w:r>
+        <w:rPr>
+          <w:rFonts w:ascii="Meiryo" w:hAnsi="Meiryo"/>
+          <w:b/>
+          <w:color w:val="C0392B"/>
+          <w:sz w:val="20"/>
+        </w:rPr>
+        <w:t>注意喚起で防ぐ：❌ 不可能（シナリオが週次で変わる）</w:t>
+      </w:r>
+    </w:p>
+    <w:p>
+      <w:r>
+        <w:rPr>
+          <w:rFonts w:ascii="Meiryo" w:hAnsi="Meiryo"/>
+          <w:b/>
+          <w:color w:val="C0392B"/>
+          <w:sz w:val="20"/>
+        </w:rPr>
+        <w:t>パターンマッチで防ぐ：❌ 不可能（毎週新パターン）</w:t>
+      </w:r>
+    </w:p>
+    <w:p>
+      <w:r>
+        <w:rPr>
+          <w:rFonts w:ascii="Meiryo" w:hAnsi="Meiryo"/>
+          <w:b/>
+          <w:color w:val="27AE60"/>
+          <w:sz w:val="20"/>
+        </w:rPr>
+        <w:t>✅ DMARC p=reject → シナリオが何であれ、偽メールは届かない</w:t>
+        <w:br/>
+        <w:t>✅ AppLocker → シナリオが何であれ、未許可アプリは実行できない</w:t>
+        <w:br/>
+        <w:t>→ 技術的対策だけが「シナリオに依存しない防御」</w:t>
+      </w:r>
+    </w:p>
+    <w:p>
       <w:r>
         <w:br w:type="page"/>
       </w:r>

</xml_diff>

<commit_message>
Complete Word report with all analysis from conversation
Added: 99% legitimate experience reproduction (10 same vs 6 different),
5 phrases banks never say, phone-connected structure, step 9 wire
transfer via victim PC with IP spoofing, behavior detection matrix.

https://claude.ai/code/session_01F7t8LKifK43o6sCdF2a3gQ
</commit_message>
<xml_diff>
--- a/Fraud_Kill_Chain.docx
+++ b/Fraud_Kill_Chain.docx
@@ -3263,6 +3263,1410 @@
         <w:t>注意喚起・ガイドライン・金融庁の要請 — すべてが「冷静な時の判断力」を前提にしている。この攻撃は、その前提自体を手順②で破壊している。</w:t>
       </w:r>
     </w:p>
+    <w:p>
+      <w:r>
+        <w:br w:type="page"/>
+      </w:r>
+    </w:p>
+    <w:p>
+      <w:pPr>
+        <w:pStyle w:val="Heading1"/>
+      </w:pPr>
+      <w:r>
+        <w:rPr>
+          <w:rFonts w:ascii="Meiryo" w:hAnsi="Meiryo"/>
+        </w:rPr>
+        <w:t>付録：正規の銀行体験を99%再現した攻撃</w:t>
+      </w:r>
+    </w:p>
+    <w:p>
+      <w:r>
+        <w:rPr>
+          <w:rFonts w:ascii="Meiryo" w:hAnsi="Meiryo"/>
+          <w:b w:val="0"/>
+          <w:sz w:val="20"/>
+        </w:rPr>
+        <w:t>この攻撃は「偽物」ではなく「正規の体験を99%再現した攻撃」である。赤い画面の色までブランドカラーに合わせている。</w:t>
+      </w:r>
+    </w:p>
+    <w:p>
+      <w:pPr>
+        <w:pStyle w:val="Heading2"/>
+      </w:pPr>
+      <w:r>
+        <w:rPr>
+          <w:rFonts w:ascii="Meiryo" w:hAnsi="Meiryo"/>
+        </w:rPr>
+        <w:t>正規と同じもの（10個）</w:t>
+      </w:r>
+    </w:p>
+    <w:p>
+      <w:r>
+        <w:rPr>
+          <w:rFonts w:ascii="Meiryo" w:hAnsi="Meiryo"/>
+          <w:b w:val="0"/>
+          <w:color w:val="27AE60"/>
+          <w:sz w:val="18"/>
+        </w:rPr>
+        <w:t>✅ 自動音声の振り分け — 銀行のコールセンターと同じ体験</w:t>
+      </w:r>
+    </w:p>
+    <w:p>
+      <w:r>
+        <w:rPr>
+          <w:rFonts w:ascii="Meiryo" w:hAnsi="Meiryo"/>
+          <w:b w:val="0"/>
+          <w:color w:val="27AE60"/>
+          <w:sz w:val="18"/>
+        </w:rPr>
+        <w:t>✅ 担当者との電話対応 — 銀行員と話している感覚と同じ</w:t>
+      </w:r>
+    </w:p>
+    <w:p>
+      <w:r>
+        <w:rPr>
+          <w:rFonts w:ascii="Meiryo" w:hAnsi="Meiryo"/>
+          <w:b w:val="0"/>
+          <w:color w:val="27AE60"/>
+          <w:sz w:val="18"/>
+        </w:rPr>
+        <w:t>✅ 「郵送した」「口座制限」のセリフ — 銀行が日常的に言うセリフと同じ</w:t>
+      </w:r>
+    </w:p>
+    <w:p>
+      <w:r>
+        <w:rPr>
+          <w:rFonts w:ascii="Meiryo" w:hAnsi="Meiryo"/>
+          <w:b w:val="0"/>
+          <w:color w:val="27AE60"/>
+          <w:sz w:val="18"/>
+        </w:rPr>
+        <w:t>✅ メールのデザイン — BizSTATIONの正規デザインを完全模倣</w:t>
+      </w:r>
+    </w:p>
+    <w:p>
+      <w:r>
+        <w:rPr>
+          <w:rFonts w:ascii="Meiryo" w:hAnsi="Meiryo"/>
+          <w:b w:val="0"/>
+          <w:color w:val="27AE60"/>
+          <w:sz w:val="18"/>
+        </w:rPr>
+        <w:t>✅ メールの件名 — 実在する案内と同じ文言を使用</w:t>
+      </w:r>
+    </w:p>
+    <w:p>
+      <w:r>
+        <w:rPr>
+          <w:rFonts w:ascii="Meiryo" w:hAnsi="Meiryo"/>
+          <w:b w:val="0"/>
+          <w:color w:val="27AE60"/>
+          <w:sz w:val="18"/>
+        </w:rPr>
+        <w:t>✅ Webページのデザイン — BizSTATIONのデザインを完全模倣</w:t>
+      </w:r>
+    </w:p>
+    <w:p>
+      <w:r>
+        <w:rPr>
+          <w:rFonts w:ascii="Meiryo" w:hAnsi="Meiryo"/>
+          <w:b w:val="0"/>
+          <w:color w:val="27AE60"/>
+          <w:sz w:val="18"/>
+        </w:rPr>
+        <w:t>✅ 赤い画面の色 — Mバンくのブランドカラー（コーポレートカラー）に合わせている</w:t>
+      </w:r>
+    </w:p>
+    <w:p>
+      <w:r>
+        <w:rPr>
+          <w:rFonts w:ascii="Meiryo" w:hAnsi="Meiryo"/>
+          <w:b w:val="0"/>
+          <w:color w:val="27AE60"/>
+          <w:sz w:val="18"/>
+        </w:rPr>
+        <w:t>✅ 赤い画面の文言 — 銀行の丁寧語・敬語と同じトーン</w:t>
+      </w:r>
+    </w:p>
+    <w:p>
+      <w:r>
+        <w:rPr>
+          <w:rFonts w:ascii="Meiryo" w:hAnsi="Meiryo"/>
+          <w:b w:val="0"/>
+          <w:color w:val="27AE60"/>
+          <w:sz w:val="18"/>
+        </w:rPr>
+        <w:t>✅ SMS認証の流れ — 正規の認証フローと同じ体験</w:t>
+      </w:r>
+    </w:p>
+    <w:p>
+      <w:r>
+        <w:rPr>
+          <w:rFonts w:ascii="Meiryo" w:hAnsi="Meiryo"/>
+          <w:b w:val="0"/>
+          <w:color w:val="27AE60"/>
+          <w:sz w:val="18"/>
+        </w:rPr>
+        <w:t>✅ セキュリティソフト推奨 — Rapportは実在するソフト（IBM提供、銀行が推奨）</w:t>
+      </w:r>
+    </w:p>
+    <w:p>
+      <w:pPr>
+        <w:pStyle w:val="Heading2"/>
+      </w:pPr>
+      <w:r>
+        <w:rPr>
+          <w:rFonts w:ascii="Meiryo" w:hAnsi="Meiryo"/>
+        </w:rPr>
+        <w:t>正規と違うもの（6個）— 全て専門知識がないと気づけない</w:t>
+      </w:r>
+    </w:p>
+    <w:p>
+      <w:r>
+        <w:rPr>
+          <w:rFonts w:ascii="Meiryo" w:hAnsi="Meiryo"/>
+          <w:b/>
+          <w:color w:val="C0392B"/>
+          <w:sz w:val="18"/>
+        </w:rPr>
+        <w:t>❌ メアドを聞く</w:t>
+      </w:r>
+    </w:p>
+    <w:p>
+      <w:r>
+        <w:rPr>
+          <w:rFonts w:ascii="Meiryo" w:hAnsi="Meiryo"/>
+          <w:b w:val="0"/>
+          <w:color w:val="888888"/>
+          <w:sz w:val="18"/>
+        </w:rPr>
+        <w:t xml:space="preserve">　BizSTATION契約時にメアド登録済み。銀行は聞かない。</w:t>
+      </w:r>
+    </w:p>
+    <w:p>
+      <w:r>
+        <w:rPr>
+          <w:rFonts w:ascii="Meiryo" w:hAnsi="Meiryo"/>
+          <w:b/>
+          <w:color w:val="C0392B"/>
+          <w:sz w:val="18"/>
+        </w:rPr>
+        <w:t>❌ 迷惑フォルダを見て</w:t>
+      </w:r>
+    </w:p>
+    <w:p>
+      <w:r>
+        <w:rPr>
+          <w:rFonts w:ascii="Meiryo" w:hAnsi="Meiryo"/>
+          <w:b w:val="0"/>
+          <w:color w:val="888888"/>
+          <w:sz w:val="18"/>
+        </w:rPr>
+        <w:t xml:space="preserve">　正規メールはSPF/DKIM/DMARC通過し正規フォルダに届く。迷惑フォルダに入らない。</w:t>
+      </w:r>
+    </w:p>
+    <w:p>
+      <w:r>
+        <w:rPr>
+          <w:rFonts w:ascii="Meiryo" w:hAnsi="Meiryo"/>
+          <w:b/>
+          <w:color w:val="C0392B"/>
+          <w:sz w:val="18"/>
+        </w:rPr>
+        <w:t>❌ メールにURLリンク</w:t>
+      </w:r>
+    </w:p>
+    <w:p>
+      <w:r>
+        <w:rPr>
+          <w:rFonts w:ascii="Meiryo" w:hAnsi="Meiryo"/>
+          <w:b w:val="0"/>
+          <w:color w:val="888888"/>
+          <w:sz w:val="18"/>
+        </w:rPr>
+        <w:t xml:space="preserve">　金融庁の要請により金融機関のメールにURL記載は禁止。</w:t>
+      </w:r>
+    </w:p>
+    <w:p>
+      <w:r>
+        <w:rPr>
+          <w:rFonts w:ascii="Meiryo" w:hAnsi="Meiryo"/>
+          <w:b/>
+          <w:color w:val="C0392B"/>
+          <w:sz w:val="18"/>
+        </w:rPr>
+        <w:t>❌ 不明な発行元でも実行して</w:t>
+      </w:r>
+    </w:p>
+    <w:p>
+      <w:r>
+        <w:rPr>
+          <w:rFonts w:ascii="Meiryo" w:hAnsi="Meiryo"/>
+          <w:b w:val="0"/>
+          <w:color w:val="888888"/>
+          <w:sz w:val="18"/>
+        </w:rPr>
+        <w:t xml:space="preserve">　正規ソフト（Rapport等）は署名済み。「不明な発行元」はありえない。ただし犯人が証明書を取得すれば消せる。</w:t>
+      </w:r>
+    </w:p>
+    <w:p>
+      <w:r>
+        <w:rPr>
+          <w:rFonts w:ascii="Meiryo" w:hAnsi="Meiryo"/>
+          <w:b/>
+          <w:color w:val="C0392B"/>
+          <w:sz w:val="18"/>
+        </w:rPr>
+        <w:t>❌ 携帯番号を聞く</w:t>
+      </w:r>
+    </w:p>
+    <w:p>
+      <w:r>
+        <w:rPr>
+          <w:rFonts w:ascii="Meiryo" w:hAnsi="Meiryo"/>
+          <w:b w:val="0"/>
+          <w:color w:val="888888"/>
+          <w:sz w:val="18"/>
+        </w:rPr>
+        <w:t xml:space="preserve">　SMS認証設定時に携帯番号は登録済み。銀行は聞かない。</w:t>
+      </w:r>
+    </w:p>
+    <w:p>
+      <w:r>
+        <w:rPr>
+          <w:rFonts w:ascii="Meiryo" w:hAnsi="Meiryo"/>
+          <w:b/>
+          <w:color w:val="C0392B"/>
+          <w:sz w:val="18"/>
+        </w:rPr>
+        <w:t>❌ 5要素を一画面で一括入力</w:t>
+      </w:r>
+    </w:p>
+    <w:p>
+      <w:r>
+        <w:rPr>
+          <w:rFonts w:ascii="Meiryo" w:hAnsi="Meiryo"/>
+          <w:b w:val="0"/>
+          <w:color w:val="888888"/>
+          <w:sz w:val="18"/>
+        </w:rPr>
+        <w:t xml:space="preserve">　正規のBizSTATIONは段階的に認証する。一括入力はありえない。</w:t>
+      </w:r>
+    </w:p>
+    <w:p>
+      <w:r>
+        <w:rPr>
+          <w:rFonts w:ascii="Meiryo" w:hAnsi="Meiryo"/>
+          <w:b/>
+          <w:sz w:val="20"/>
+        </w:rPr>
+        <w:t>正規と同じ：10個。正規と違う：6個。しかも「正規と違う」6個は全て専門知識がないと気づけない。唯一「不明な発行元」だけがOSの警告で気づけるが、犯人のレベルアップで消える。</w:t>
+      </w:r>
+    </w:p>
+    <w:p>
+      <w:pPr>
+        <w:pStyle w:val="Heading2"/>
+      </w:pPr>
+      <w:r>
+        <w:rPr>
+          <w:rFonts w:ascii="Meiryo" w:hAnsi="Meiryo"/>
+        </w:rPr>
+        <w:t>「銀行が絶対に言わないセリフ」5つ — 全て手順②の恐怖で無効化</w:t>
+      </w:r>
+    </w:p>
+    <w:tbl>
+      <w:tblPr>
+        <w:tblStyle w:val="TableGrid"/>
+        <w:tblW w:type="auto" w:w="0"/>
+        <w:tblLook w:firstColumn="1" w:firstRow="1" w:lastColumn="0" w:lastRow="0" w:noHBand="0" w:noVBand="1" w:val="04A0"/>
+      </w:tblPr>
+      <w:tblGrid>
+        <w:gridCol w:w="3024"/>
+        <w:gridCol w:w="3024"/>
+        <w:gridCol w:w="3024"/>
+      </w:tblGrid>
+      <w:tr>
+        <w:tc>
+          <w:tcPr>
+            <w:tcW w:type="dxa" w:w="3024"/>
+            <w:shd w:fill="C0392B" w:val="clear"/>
+          </w:tcPr>
+          <w:p>
+            <w:r>
+              <w:rPr>
+                <w:rFonts w:ascii="Meiryo" w:hAnsi="Meiryo"/>
+                <w:b/>
+                <w:color w:val="FFFFFF"/>
+                <w:sz w:val="16"/>
+              </w:rPr>
+              <w:t>手順</w:t>
+            </w:r>
+          </w:p>
+        </w:tc>
+        <w:tc>
+          <w:tcPr>
+            <w:tcW w:type="dxa" w:w="3024"/>
+            <w:shd w:fill="C0392B" w:val="clear"/>
+          </w:tcPr>
+          <w:p>
+            <w:r>
+              <w:rPr>
+                <w:rFonts w:ascii="Meiryo" w:hAnsi="Meiryo"/>
+                <w:b/>
+                <w:color w:val="FFFFFF"/>
+                <w:sz w:val="16"/>
+              </w:rPr>
+              <w:t>銀行が絶対に言わないセリフ</w:t>
+            </w:r>
+          </w:p>
+        </w:tc>
+        <w:tc>
+          <w:tcPr>
+            <w:tcW w:type="dxa" w:w="3024"/>
+            <w:shd w:fill="C0392B" w:val="clear"/>
+          </w:tcPr>
+          <w:p>
+            <w:r>
+              <w:rPr>
+                <w:rFonts w:ascii="Meiryo" w:hAnsi="Meiryo"/>
+                <w:b/>
+                <w:color w:val="FFFFFF"/>
+                <w:sz w:val="16"/>
+              </w:rPr>
+              <w:t>理由</w:t>
+            </w:r>
+          </w:p>
+        </w:tc>
+      </w:tr>
+      <w:tr>
+        <w:tc>
+          <w:tcPr>
+            <w:tcW w:type="dxa" w:w="3024"/>
+          </w:tcPr>
+          <w:p>
+            <w:r/>
+            <w:r>
+              <w:rPr>
+                <w:rFonts w:ascii="Meiryo" w:hAnsi="Meiryo"/>
+                <w:b w:val="0"/>
+                <w:sz w:val="18"/>
+              </w:rPr>
+              <w:t>③</w:t>
+            </w:r>
+          </w:p>
+        </w:tc>
+        <w:tc>
+          <w:tcPr>
+            <w:tcW w:type="dxa" w:w="3024"/>
+          </w:tcPr>
+          <w:p>
+            <w:r/>
+            <w:r>
+              <w:rPr>
+                <w:rFonts w:ascii="Meiryo" w:hAnsi="Meiryo"/>
+                <w:b w:val="0"/>
+                <w:sz w:val="18"/>
+              </w:rPr>
+              <w:t>「メアドを教えてください」</w:t>
+            </w:r>
+          </w:p>
+        </w:tc>
+        <w:tc>
+          <w:tcPr>
+            <w:tcW w:type="dxa" w:w="3024"/>
+          </w:tcPr>
+          <w:p>
+            <w:r/>
+            <w:r>
+              <w:rPr>
+                <w:rFonts w:ascii="Meiryo" w:hAnsi="Meiryo"/>
+                <w:b w:val="0"/>
+                <w:sz w:val="18"/>
+              </w:rPr>
+              <w:t>契約時に登録済み</w:t>
+            </w:r>
+          </w:p>
+        </w:tc>
+      </w:tr>
+      <w:tr>
+        <w:tc>
+          <w:tcPr>
+            <w:tcW w:type="dxa" w:w="3024"/>
+          </w:tcPr>
+          <w:p>
+            <w:r/>
+            <w:r>
+              <w:rPr>
+                <w:rFonts w:ascii="Meiryo" w:hAnsi="Meiryo"/>
+                <w:b w:val="0"/>
+                <w:sz w:val="18"/>
+              </w:rPr>
+              <w:t>④</w:t>
+            </w:r>
+          </w:p>
+        </w:tc>
+        <w:tc>
+          <w:tcPr>
+            <w:tcW w:type="dxa" w:w="3024"/>
+          </w:tcPr>
+          <w:p>
+            <w:r/>
+            <w:r>
+              <w:rPr>
+                <w:rFonts w:ascii="Meiryo" w:hAnsi="Meiryo"/>
+                <w:b w:val="0"/>
+                <w:sz w:val="18"/>
+              </w:rPr>
+              <w:t>「迷惑メールフォルダを確認してください」</w:t>
+            </w:r>
+          </w:p>
+        </w:tc>
+        <w:tc>
+          <w:tcPr>
+            <w:tcW w:type="dxa" w:w="3024"/>
+          </w:tcPr>
+          <w:p>
+            <w:r/>
+            <w:r>
+              <w:rPr>
+                <w:rFonts w:ascii="Meiryo" w:hAnsi="Meiryo"/>
+                <w:b w:val="0"/>
+                <w:sz w:val="18"/>
+              </w:rPr>
+              <w:t>正規メールは迷惑フォルダに入らない</w:t>
+            </w:r>
+          </w:p>
+        </w:tc>
+      </w:tr>
+      <w:tr>
+        <w:tc>
+          <w:tcPr>
+            <w:tcW w:type="dxa" w:w="3024"/>
+          </w:tcPr>
+          <w:p>
+            <w:r/>
+            <w:r>
+              <w:rPr>
+                <w:rFonts w:ascii="Meiryo" w:hAnsi="Meiryo"/>
+                <w:b w:val="0"/>
+                <w:sz w:val="18"/>
+              </w:rPr>
+              <w:t>⑤</w:t>
+            </w:r>
+          </w:p>
+        </w:tc>
+        <w:tc>
+          <w:tcPr>
+            <w:tcW w:type="dxa" w:w="3024"/>
+          </w:tcPr>
+          <w:p>
+            <w:r/>
+            <w:r>
+              <w:rPr>
+                <w:rFonts w:ascii="Meiryo" w:hAnsi="Meiryo"/>
+                <w:b w:val="0"/>
+                <w:sz w:val="18"/>
+              </w:rPr>
+              <w:t>「メールのボタンをクリックしてください」</w:t>
+            </w:r>
+          </w:p>
+        </w:tc>
+        <w:tc>
+          <w:tcPr>
+            <w:tcW w:type="dxa" w:w="3024"/>
+          </w:tcPr>
+          <w:p>
+            <w:r/>
+            <w:r>
+              <w:rPr>
+                <w:rFonts w:ascii="Meiryo" w:hAnsi="Meiryo"/>
+                <w:b w:val="0"/>
+                <w:sz w:val="18"/>
+              </w:rPr>
+              <w:t>金融庁が禁止。銀行の方針でも禁止。</w:t>
+            </w:r>
+          </w:p>
+        </w:tc>
+      </w:tr>
+      <w:tr>
+        <w:tc>
+          <w:tcPr>
+            <w:tcW w:type="dxa" w:w="3024"/>
+          </w:tcPr>
+          <w:p>
+            <w:r/>
+            <w:r>
+              <w:rPr>
+                <w:rFonts w:ascii="Meiryo" w:hAnsi="Meiryo"/>
+                <w:b w:val="0"/>
+                <w:sz w:val="18"/>
+              </w:rPr>
+              <w:t>⑥</w:t>
+            </w:r>
+          </w:p>
+        </w:tc>
+        <w:tc>
+          <w:tcPr>
+            <w:tcW w:type="dxa" w:w="3024"/>
+          </w:tcPr>
+          <w:p>
+            <w:r/>
+            <w:r>
+              <w:rPr>
+                <w:rFonts w:ascii="Meiryo" w:hAnsi="Meiryo"/>
+                <w:b w:val="0"/>
+                <w:sz w:val="18"/>
+              </w:rPr>
+              <w:t>「不明な発行元でも実行してください」</w:t>
+            </w:r>
+          </w:p>
+        </w:tc>
+        <w:tc>
+          <w:tcPr>
+            <w:tcW w:type="dxa" w:w="3024"/>
+          </w:tcPr>
+          <w:p>
+            <w:r/>
+            <w:r>
+              <w:rPr>
+                <w:rFonts w:ascii="Meiryo" w:hAnsi="Meiryo"/>
+                <w:b w:val="0"/>
+                <w:sz w:val="18"/>
+              </w:rPr>
+              <w:t>正規ソフトは署名済み</w:t>
+            </w:r>
+          </w:p>
+        </w:tc>
+      </w:tr>
+      <w:tr>
+        <w:tc>
+          <w:tcPr>
+            <w:tcW w:type="dxa" w:w="3024"/>
+          </w:tcPr>
+          <w:p>
+            <w:r/>
+            <w:r>
+              <w:rPr>
+                <w:rFonts w:ascii="Meiryo" w:hAnsi="Meiryo"/>
+                <w:b w:val="0"/>
+                <w:sz w:val="18"/>
+              </w:rPr>
+              <w:t>⑧</w:t>
+            </w:r>
+          </w:p>
+        </w:tc>
+        <w:tc>
+          <w:tcPr>
+            <w:tcW w:type="dxa" w:w="3024"/>
+          </w:tcPr>
+          <w:p>
+            <w:r/>
+            <w:r>
+              <w:rPr>
+                <w:rFonts w:ascii="Meiryo" w:hAnsi="Meiryo"/>
+                <w:b w:val="0"/>
+                <w:sz w:val="18"/>
+              </w:rPr>
+              <w:t>「携帯電話の番号を教えてください」</w:t>
+            </w:r>
+          </w:p>
+        </w:tc>
+        <w:tc>
+          <w:tcPr>
+            <w:tcW w:type="dxa" w:w="3024"/>
+          </w:tcPr>
+          <w:p>
+            <w:r/>
+            <w:r>
+              <w:rPr>
+                <w:rFonts w:ascii="Meiryo" w:hAnsi="Meiryo"/>
+                <w:b w:val="0"/>
+                <w:sz w:val="18"/>
+              </w:rPr>
+              <w:t>SMS認証設定時に登録済み</w:t>
+            </w:r>
+          </w:p>
+        </w:tc>
+      </w:tr>
+    </w:tbl>
+    <w:p>
+      <w:r>
+        <w:rPr>
+          <w:rFonts w:ascii="Meiryo" w:hAnsi="Meiryo"/>
+          <w:b/>
+          <w:color w:val="C0392B"/>
+          <w:sz w:val="20"/>
+        </w:rPr>
+        <w:t>破綻ポイントが5つもあるのに全部突破される。たった1つの理由：手順②「口座の利用制限をしています」</w:t>
+      </w:r>
+    </w:p>
+    <w:p>
+      <w:r>
+        <w:br w:type="page"/>
+      </w:r>
+    </w:p>
+    <w:p>
+      <w:pPr>
+        <w:pStyle w:val="Heading1"/>
+      </w:pPr>
+      <w:r>
+        <w:rPr>
+          <w:rFonts w:ascii="Meiryo" w:hAnsi="Meiryo"/>
+        </w:rPr>
+        <w:t>付録：1本の電話 — つないだまま全手順を完了させる</w:t>
+      </w:r>
+    </w:p>
+    <w:p>
+      <w:r>
+        <w:rPr>
+          <w:rFonts w:ascii="Meiryo" w:hAnsi="Meiryo"/>
+          <w:b w:val="0"/>
+          <w:sz w:val="20"/>
+        </w:rPr>
+        <w:t>手順①から手順⑨まで、1本の電話が切れていない。被害者にとっては「銀行の担当者に電話で付き添ってもらいながら手続きをした」という体験でしかない。</w:t>
+      </w:r>
+    </w:p>
+    <w:p>
+      <w:pPr>
+        <w:pStyle w:val="Heading2"/>
+      </w:pPr>
+      <w:r>
+        <w:rPr>
+          <w:rFonts w:ascii="Meiryo" w:hAnsi="Meiryo"/>
+        </w:rPr>
+        <w:t>電話をつないだままにする5つの効果</w:t>
+      </w:r>
+    </w:p>
+    <w:tbl>
+      <w:tblPr>
+        <w:tblStyle w:val="TableGrid"/>
+        <w:tblW w:type="auto" w:w="0"/>
+        <w:tblLook w:firstColumn="1" w:firstRow="1" w:lastColumn="0" w:lastRow="0" w:noHBand="0" w:noVBand="1" w:val="04A0"/>
+      </w:tblPr>
+      <w:tblGrid>
+        <w:gridCol w:w="4536"/>
+        <w:gridCol w:w="4536"/>
+      </w:tblGrid>
+      <w:tr>
+        <w:tc>
+          <w:tcPr>
+            <w:tcW w:type="dxa" w:w="4536"/>
+            <w:shd w:fill="222222" w:val="clear"/>
+          </w:tcPr>
+          <w:p>
+            <w:r>
+              <w:rPr>
+                <w:rFonts w:ascii="Meiryo" w:hAnsi="Meiryo"/>
+                <w:b/>
+                <w:color w:val="FFFFFF"/>
+                <w:sz w:val="16"/>
+              </w:rPr>
+              <w:t>効果</w:t>
+            </w:r>
+          </w:p>
+        </w:tc>
+        <w:tc>
+          <w:tcPr>
+            <w:tcW w:type="dxa" w:w="4536"/>
+            <w:shd w:fill="222222" w:val="clear"/>
+          </w:tcPr>
+          <w:p>
+            <w:r>
+              <w:rPr>
+                <w:rFonts w:ascii="Meiryo" w:hAnsi="Meiryo"/>
+                <w:b/>
+                <w:color w:val="FFFFFF"/>
+                <w:sz w:val="16"/>
+              </w:rPr>
+              <w:t>理由</w:t>
+            </w:r>
+          </w:p>
+        </w:tc>
+      </w:tr>
+      <w:tr>
+        <w:tc>
+          <w:tcPr>
+            <w:tcW w:type="dxa" w:w="4536"/>
+          </w:tcPr>
+          <w:p>
+            <w:r/>
+            <w:r>
+              <w:rPr>
+                <w:rFonts w:ascii="Meiryo" w:hAnsi="Meiryo"/>
+                <w:b w:val="0"/>
+                <w:sz w:val="18"/>
+              </w:rPr>
+              <w:t>考える隙を与えない</w:t>
+            </w:r>
+          </w:p>
+        </w:tc>
+        <w:tc>
+          <w:tcPr>
+            <w:tcW w:type="dxa" w:w="4536"/>
+          </w:tcPr>
+          <w:p>
+            <w:r/>
+            <w:r>
+              <w:rPr>
+                <w:rFonts w:ascii="Meiryo" w:hAnsi="Meiryo"/>
+                <w:b w:val="0"/>
+                <w:sz w:val="18"/>
+              </w:rPr>
+              <w:t>電話を切ったら冷静になる。切らせない。</w:t>
+            </w:r>
+          </w:p>
+        </w:tc>
+      </w:tr>
+      <w:tr>
+        <w:tc>
+          <w:tcPr>
+            <w:tcW w:type="dxa" w:w="4536"/>
+          </w:tcPr>
+          <w:p>
+            <w:r/>
+            <w:r>
+              <w:rPr>
+                <w:rFonts w:ascii="Meiryo" w:hAnsi="Meiryo"/>
+                <w:b w:val="0"/>
+                <w:sz w:val="18"/>
+              </w:rPr>
+              <w:t>リアルタイム制御</w:t>
+            </w:r>
+          </w:p>
+        </w:tc>
+        <w:tc>
+          <w:tcPr>
+            <w:tcW w:type="dxa" w:w="4536"/>
+          </w:tcPr>
+          <w:p>
+            <w:r/>
+            <w:r>
+              <w:rPr>
+                <w:rFonts w:ascii="Meiryo" w:hAnsi="Meiryo"/>
+                <w:b w:val="0"/>
+                <w:sz w:val="18"/>
+              </w:rPr>
+              <w:t>被害者の画面状況に合わせて次の指示を出せる。</w:t>
+            </w:r>
+          </w:p>
+        </w:tc>
+      </w:tr>
+      <w:tr>
+        <w:tc>
+          <w:tcPr>
+            <w:tcW w:type="dxa" w:w="4536"/>
+          </w:tcPr>
+          <w:p>
+            <w:r/>
+            <w:r>
+              <w:rPr>
+                <w:rFonts w:ascii="Meiryo" w:hAnsi="Meiryo"/>
+                <w:b w:val="0"/>
+                <w:sz w:val="18"/>
+              </w:rPr>
+              <w:t>離脱防止</w:t>
+            </w:r>
+          </w:p>
+        </w:tc>
+        <w:tc>
+          <w:tcPr>
+            <w:tcW w:type="dxa" w:w="4536"/>
+          </w:tcPr>
+          <w:p>
+            <w:r/>
+            <w:r>
+              <w:rPr>
+                <w:rFonts w:ascii="Meiryo" w:hAnsi="Meiryo"/>
+                <w:b w:val="0"/>
+                <w:sz w:val="18"/>
+              </w:rPr>
+              <w:t>「このままお待ちください」で引き留められる。</w:t>
+            </w:r>
+          </w:p>
+        </w:tc>
+      </w:tr>
+      <w:tr>
+        <w:tc>
+          <w:tcPr>
+            <w:tcW w:type="dxa" w:w="4536"/>
+          </w:tcPr>
+          <w:p>
+            <w:r/>
+            <w:r>
+              <w:rPr>
+                <w:rFonts w:ascii="Meiryo" w:hAnsi="Meiryo"/>
+                <w:b w:val="0"/>
+                <w:sz w:val="18"/>
+              </w:rPr>
+              <w:t>第三者への相談を防ぐ</w:t>
+            </w:r>
+          </w:p>
+        </w:tc>
+        <w:tc>
+          <w:tcPr>
+            <w:tcW w:type="dxa" w:w="4536"/>
+          </w:tcPr>
+          <w:p>
+            <w:r/>
+            <w:r>
+              <w:rPr>
+                <w:rFonts w:ascii="Meiryo" w:hAnsi="Meiryo"/>
+                <w:b w:val="0"/>
+                <w:sz w:val="18"/>
+              </w:rPr>
+              <w:t>電話中なので同僚や家族に相談できない。特にワンオペの零細企業では致命的。</w:t>
+            </w:r>
+          </w:p>
+        </w:tc>
+      </w:tr>
+      <w:tr>
+        <w:tc>
+          <w:tcPr>
+            <w:tcW w:type="dxa" w:w="4536"/>
+          </w:tcPr>
+          <w:p>
+            <w:r/>
+            <w:r>
+              <w:rPr>
+                <w:rFonts w:ascii="Meiryo" w:hAnsi="Meiryo"/>
+                <w:b w:val="0"/>
+                <w:sz w:val="18"/>
+              </w:rPr>
+              <w:t>信頼の維持</w:t>
+            </w:r>
+          </w:p>
+        </w:tc>
+        <w:tc>
+          <w:tcPr>
+            <w:tcW w:type="dxa" w:w="4536"/>
+          </w:tcPr>
+          <w:p>
+            <w:r/>
+            <w:r>
+              <w:rPr>
+                <w:rFonts w:ascii="Meiryo" w:hAnsi="Meiryo"/>
+                <w:b w:val="0"/>
+                <w:sz w:val="18"/>
+              </w:rPr>
+              <w:t>銀行員が丁寧に付き添ってくれている感覚。</w:t>
+            </w:r>
+          </w:p>
+        </w:tc>
+      </w:tr>
+    </w:tbl>
+    <w:p>
+      <w:pPr>
+        <w:pStyle w:val="Heading2"/>
+      </w:pPr>
+      <w:r>
+        <w:rPr>
+          <w:rFonts w:ascii="Meiryo" w:hAnsi="Meiryo"/>
+        </w:rPr>
+        <w:t>もし電話が切れたら（攻撃失敗）</w:t>
+      </w:r>
+    </w:p>
+    <w:p>
+      <w:r>
+        <w:rPr>
+          <w:rFonts w:ascii="Meiryo" w:hAnsi="Meiryo"/>
+          <w:b w:val="0"/>
+          <w:sz w:val="18"/>
+        </w:rPr>
+        <w:t>• 「本当に銀行からの電話だったのか？」と疑問に思う</w:t>
+        <w:br/>
+        <w:t>• 銀行の公式番号にかけ直す</w:t>
+        <w:br/>
+        <w:t>• 同僚や上司に相談する</w:t>
+        <w:br/>
+        <w:t>• ネットで調べる</w:t>
+      </w:r>
+    </w:p>
+    <w:p>
+      <w:r>
+        <w:rPr>
+          <w:rFonts w:ascii="Meiryo" w:hAnsi="Meiryo"/>
+          <w:b/>
+          <w:color w:val="C0392B"/>
+          <w:sz w:val="20"/>
+        </w:rPr>
+        <w:t>これらの行動をすべて封じるために、電話をつないだまま全手順を一気に完了させている。</w:t>
+      </w:r>
+    </w:p>
+    <w:p>
+      <w:pPr>
+        <w:pStyle w:val="Heading1"/>
+      </w:pPr>
+      <w:r>
+        <w:rPr>
+          <w:rFonts w:ascii="Meiryo" w:hAnsi="Meiryo"/>
+        </w:rPr>
+        <w:t>付録：手順⑨ 不正送金 — 被害者のPCを経由しIPアドレスを偽装</w:t>
+      </w:r>
+    </w:p>
+    <w:p>
+      <w:r>
+        <w:rPr>
+          <w:rFonts w:ascii="Meiryo" w:hAnsi="Meiryo"/>
+          <w:b w:val="0"/>
+          <w:sz w:val="20"/>
+        </w:rPr>
+        <w:t>犯人は赤い画面の裏で被害者のPC（ScreenConnect経由）からBizSTATIONにアクセスし、窃取した認証情報で送金を実行する。犯人のPCからではなく被害者のPCを経由する理由は、IPアドレスを「いつもの場所」に見せるため。</w:t>
+      </w:r>
+    </w:p>
+    <w:p>
+      <w:pPr>
+        <w:pStyle w:val="Heading2"/>
+      </w:pPr>
+      <w:r>
+        <w:rPr>
+          <w:rFonts w:ascii="Meiryo" w:hAnsi="Meiryo"/>
+        </w:rPr>
+        <w:t>銀行側の振る舞い検知</w:t>
+      </w:r>
+    </w:p>
+    <w:tbl>
+      <w:tblPr>
+        <w:tblStyle w:val="TableGrid"/>
+        <w:tblW w:type="auto" w:w="0"/>
+        <w:tblLook w:firstColumn="1" w:firstRow="1" w:lastColumn="0" w:lastRow="0" w:noHBand="0" w:noVBand="1" w:val="04A0"/>
+      </w:tblPr>
+      <w:tblGrid>
+        <w:gridCol w:w="2268"/>
+        <w:gridCol w:w="2268"/>
+        <w:gridCol w:w="2268"/>
+        <w:gridCol w:w="2268"/>
+      </w:tblGrid>
+      <w:tr>
+        <w:tc>
+          <w:tcPr>
+            <w:tcW w:type="dxa" w:w="2268"/>
+            <w:shd w:fill="222222" w:val="clear"/>
+          </w:tcPr>
+          <w:p>
+            <w:r>
+              <w:rPr>
+                <w:rFonts w:ascii="Meiryo" w:hAnsi="Meiryo"/>
+                <w:b/>
+                <w:color w:val="FFFFFF"/>
+                <w:sz w:val="16"/>
+              </w:rPr>
+              <w:t>検知項目</w:t>
+            </w:r>
+          </w:p>
+        </w:tc>
+        <w:tc>
+          <w:tcPr>
+            <w:tcW w:type="dxa" w:w="2268"/>
+            <w:shd w:fill="222222" w:val="clear"/>
+          </w:tcPr>
+          <w:p>
+            <w:r>
+              <w:rPr>
+                <w:rFonts w:ascii="Meiryo" w:hAnsi="Meiryo"/>
+                <w:b/>
+                <w:color w:val="FFFFFF"/>
+                <w:sz w:val="16"/>
+              </w:rPr>
+              <w:t>正常</w:t>
+            </w:r>
+          </w:p>
+        </w:tc>
+        <w:tc>
+          <w:tcPr>
+            <w:tcW w:type="dxa" w:w="2268"/>
+            <w:shd w:fill="222222" w:val="clear"/>
+          </w:tcPr>
+          <w:p>
+            <w:r>
+              <w:rPr>
+                <w:rFonts w:ascii="Meiryo" w:hAnsi="Meiryo"/>
+                <w:b/>
+                <w:color w:val="FFFFFF"/>
+                <w:sz w:val="16"/>
+              </w:rPr>
+              <w:t>この攻撃</w:t>
+            </w:r>
+          </w:p>
+        </w:tc>
+        <w:tc>
+          <w:tcPr>
+            <w:tcW w:type="dxa" w:w="2268"/>
+            <w:shd w:fill="222222" w:val="clear"/>
+          </w:tcPr>
+          <w:p>
+            <w:r>
+              <w:rPr>
+                <w:rFonts w:ascii="Meiryo" w:hAnsi="Meiryo"/>
+                <w:b/>
+                <w:color w:val="FFFFFF"/>
+                <w:sz w:val="16"/>
+              </w:rPr>
+              <w:t>結果</w:t>
+            </w:r>
+          </w:p>
+        </w:tc>
+      </w:tr>
+      <w:tr>
+        <w:tc>
+          <w:tcPr>
+            <w:tcW w:type="dxa" w:w="2268"/>
+            <w:shd w:fill="FDEDEC" w:val="clear"/>
+          </w:tcPr>
+          <w:p>
+            <w:r/>
+            <w:r>
+              <w:rPr>
+                <w:rFonts w:ascii="Meiryo" w:hAnsi="Meiryo"/>
+                <w:b w:val="0"/>
+                <w:sz w:val="18"/>
+              </w:rPr>
+              <w:t>IPアドレス</w:t>
+            </w:r>
+          </w:p>
+        </w:tc>
+        <w:tc>
+          <w:tcPr>
+            <w:tcW w:type="dxa" w:w="2268"/>
+            <w:shd w:fill="FDEDEC" w:val="clear"/>
+          </w:tcPr>
+          <w:p>
+            <w:r/>
+            <w:r>
+              <w:rPr>
+                <w:rFonts w:ascii="Meiryo" w:hAnsi="Meiryo"/>
+                <w:b w:val="0"/>
+                <w:sz w:val="18"/>
+              </w:rPr>
+              <w:t>いつもの場所</w:t>
+            </w:r>
+          </w:p>
+        </w:tc>
+        <w:tc>
+          <w:tcPr>
+            <w:tcW w:type="dxa" w:w="2268"/>
+            <w:shd w:fill="FDEDEC" w:val="clear"/>
+          </w:tcPr>
+          <w:p>
+            <w:r/>
+            <w:r>
+              <w:rPr>
+                <w:rFonts w:ascii="Meiryo" w:hAnsi="Meiryo"/>
+                <w:b w:val="0"/>
+                <w:sz w:val="18"/>
+              </w:rPr>
+              <w:t>いつもの場所（PC経由）</w:t>
+            </w:r>
+          </w:p>
+        </w:tc>
+        <w:tc>
+          <w:tcPr>
+            <w:tcW w:type="dxa" w:w="2268"/>
+            <w:shd w:fill="FDEDEC" w:val="clear"/>
+          </w:tcPr>
+          <w:p>
+            <w:r/>
+            <w:r>
+              <w:rPr>
+                <w:rFonts w:ascii="Meiryo" w:hAnsi="Meiryo"/>
+                <w:b w:val="0"/>
+                <w:sz w:val="18"/>
+              </w:rPr>
+              <w:t>すり抜ける</w:t>
+            </w:r>
+          </w:p>
+        </w:tc>
+      </w:tr>
+      <w:tr>
+        <w:tc>
+          <w:tcPr>
+            <w:tcW w:type="dxa" w:w="2268"/>
+            <w:shd w:fill="FDEDEC" w:val="clear"/>
+          </w:tcPr>
+          <w:p>
+            <w:r/>
+            <w:r>
+              <w:rPr>
+                <w:rFonts w:ascii="Meiryo" w:hAnsi="Meiryo"/>
+                <w:b w:val="0"/>
+                <w:sz w:val="18"/>
+              </w:rPr>
+              <w:t>時間帯</w:t>
+            </w:r>
+          </w:p>
+        </w:tc>
+        <w:tc>
+          <w:tcPr>
+            <w:tcW w:type="dxa" w:w="2268"/>
+            <w:shd w:fill="FDEDEC" w:val="clear"/>
+          </w:tcPr>
+          <w:p>
+            <w:r/>
+            <w:r>
+              <w:rPr>
+                <w:rFonts w:ascii="Meiryo" w:hAnsi="Meiryo"/>
+                <w:b w:val="0"/>
+                <w:sz w:val="18"/>
+              </w:rPr>
+              <w:t>業務時間内</w:t>
+            </w:r>
+          </w:p>
+        </w:tc>
+        <w:tc>
+          <w:tcPr>
+            <w:tcW w:type="dxa" w:w="2268"/>
+            <w:shd w:fill="FDEDEC" w:val="clear"/>
+          </w:tcPr>
+          <w:p>
+            <w:r/>
+            <w:r>
+              <w:rPr>
+                <w:rFonts w:ascii="Meiryo" w:hAnsi="Meiryo"/>
+                <w:b w:val="0"/>
+                <w:sz w:val="18"/>
+              </w:rPr>
+              <w:t>業務時間内（電話中）</w:t>
+            </w:r>
+          </w:p>
+        </w:tc>
+        <w:tc>
+          <w:tcPr>
+            <w:tcW w:type="dxa" w:w="2268"/>
+            <w:shd w:fill="FDEDEC" w:val="clear"/>
+          </w:tcPr>
+          <w:p>
+            <w:r/>
+            <w:r>
+              <w:rPr>
+                <w:rFonts w:ascii="Meiryo" w:hAnsi="Meiryo"/>
+                <w:b w:val="0"/>
+                <w:sz w:val="18"/>
+              </w:rPr>
+              <w:t>すり抜ける</w:t>
+            </w:r>
+          </w:p>
+        </w:tc>
+      </w:tr>
+      <w:tr>
+        <w:tc>
+          <w:tcPr>
+            <w:tcW w:type="dxa" w:w="2268"/>
+            <w:shd w:fill="EAFAF1" w:val="clear"/>
+          </w:tcPr>
+          <w:p>
+            <w:r/>
+            <w:r>
+              <w:rPr>
+                <w:rFonts w:ascii="Meiryo" w:hAnsi="Meiryo"/>
+                <w:b w:val="0"/>
+                <w:sz w:val="18"/>
+              </w:rPr>
+              <w:t>送金先口座</w:t>
+            </w:r>
+          </w:p>
+        </w:tc>
+        <w:tc>
+          <w:tcPr>
+            <w:tcW w:type="dxa" w:w="2268"/>
+            <w:shd w:fill="EAFAF1" w:val="clear"/>
+          </w:tcPr>
+          <w:p>
+            <w:r/>
+            <w:r>
+              <w:rPr>
+                <w:rFonts w:ascii="Meiryo" w:hAnsi="Meiryo"/>
+                <w:b w:val="0"/>
+                <w:sz w:val="18"/>
+              </w:rPr>
+              <w:t>取引先</w:t>
+            </w:r>
+          </w:p>
+        </w:tc>
+        <w:tc>
+          <w:tcPr>
+            <w:tcW w:type="dxa" w:w="2268"/>
+            <w:shd w:fill="EAFAF1" w:val="clear"/>
+          </w:tcPr>
+          <w:p>
+            <w:r/>
+            <w:r>
+              <w:rPr>
+                <w:rFonts w:ascii="Meiryo" w:hAnsi="Meiryo"/>
+                <w:b w:val="0"/>
+                <w:sz w:val="18"/>
+              </w:rPr>
+              <w:t>初めての口座</w:t>
+            </w:r>
+          </w:p>
+        </w:tc>
+        <w:tc>
+          <w:tcPr>
+            <w:tcW w:type="dxa" w:w="2268"/>
+            <w:shd w:fill="EAFAF1" w:val="clear"/>
+          </w:tcPr>
+          <w:p>
+            <w:r/>
+            <w:r>
+              <w:rPr>
+                <w:rFonts w:ascii="Meiryo" w:hAnsi="Meiryo"/>
+                <w:b w:val="0"/>
+                <w:sz w:val="18"/>
+              </w:rPr>
+              <w:t>検知できる ★</w:t>
+            </w:r>
+          </w:p>
+        </w:tc>
+      </w:tr>
+      <w:tr>
+        <w:tc>
+          <w:tcPr>
+            <w:tcW w:type="dxa" w:w="2268"/>
+            <w:shd w:fill="EAFAF1" w:val="clear"/>
+          </w:tcPr>
+          <w:p>
+            <w:r/>
+            <w:r>
+              <w:rPr>
+                <w:rFonts w:ascii="Meiryo" w:hAnsi="Meiryo"/>
+                <w:b w:val="0"/>
+                <w:sz w:val="18"/>
+              </w:rPr>
+              <w:t>送金金額</w:t>
+            </w:r>
+          </w:p>
+        </w:tc>
+        <w:tc>
+          <w:tcPr>
+            <w:tcW w:type="dxa" w:w="2268"/>
+            <w:shd w:fill="EAFAF1" w:val="clear"/>
+          </w:tcPr>
+          <w:p>
+            <w:r/>
+            <w:r>
+              <w:rPr>
+                <w:rFonts w:ascii="Meiryo" w:hAnsi="Meiryo"/>
+                <w:b w:val="0"/>
+                <w:sz w:val="18"/>
+              </w:rPr>
+              <w:t>通常範囲</w:t>
+            </w:r>
+          </w:p>
+        </w:tc>
+        <w:tc>
+          <w:tcPr>
+            <w:tcW w:type="dxa" w:w="2268"/>
+            <w:shd w:fill="EAFAF1" w:val="clear"/>
+          </w:tcPr>
+          <w:p>
+            <w:r/>
+            <w:r>
+              <w:rPr>
+                <w:rFonts w:ascii="Meiryo" w:hAnsi="Meiryo"/>
+                <w:b w:val="0"/>
+                <w:sz w:val="18"/>
+              </w:rPr>
+              <w:t>通常より大きい可能性</w:t>
+            </w:r>
+          </w:p>
+        </w:tc>
+        <w:tc>
+          <w:tcPr>
+            <w:tcW w:type="dxa" w:w="2268"/>
+            <w:shd w:fill="EAFAF1" w:val="clear"/>
+          </w:tcPr>
+          <w:p>
+            <w:r/>
+            <w:r>
+              <w:rPr>
+                <w:rFonts w:ascii="Meiryo" w:hAnsi="Meiryo"/>
+                <w:b w:val="0"/>
+                <w:sz w:val="18"/>
+              </w:rPr>
+              <w:t>検知できる ★</w:t>
+            </w:r>
+          </w:p>
+        </w:tc>
+      </w:tr>
+      <w:tr>
+        <w:tc>
+          <w:tcPr>
+            <w:tcW w:type="dxa" w:w="2268"/>
+            <w:shd w:fill="EAFAF1" w:val="clear"/>
+          </w:tcPr>
+          <w:p>
+            <w:r/>
+            <w:r>
+              <w:rPr>
+                <w:rFonts w:ascii="Meiryo" w:hAnsi="Meiryo"/>
+                <w:b w:val="0"/>
+                <w:sz w:val="18"/>
+              </w:rPr>
+              <w:t>操作速度</w:t>
+            </w:r>
+          </w:p>
+        </w:tc>
+        <w:tc>
+          <w:tcPr>
+            <w:tcW w:type="dxa" w:w="2268"/>
+            <w:shd w:fill="EAFAF1" w:val="clear"/>
+          </w:tcPr>
+          <w:p>
+            <w:r/>
+            <w:r>
+              <w:rPr>
+                <w:rFonts w:ascii="Meiryo" w:hAnsi="Meiryo"/>
+                <w:b w:val="0"/>
+                <w:sz w:val="18"/>
+              </w:rPr>
+              <w:t>人間の速度</w:t>
+            </w:r>
+          </w:p>
+        </w:tc>
+        <w:tc>
+          <w:tcPr>
+            <w:tcW w:type="dxa" w:w="2268"/>
+            <w:shd w:fill="EAFAF1" w:val="clear"/>
+          </w:tcPr>
+          <w:p>
+            <w:r/>
+            <w:r>
+              <w:rPr>
+                <w:rFonts w:ascii="Meiryo" w:hAnsi="Meiryo"/>
+                <w:b w:val="0"/>
+                <w:sz w:val="18"/>
+              </w:rPr>
+              <w:t>異常に速い可能性</w:t>
+            </w:r>
+          </w:p>
+        </w:tc>
+        <w:tc>
+          <w:tcPr>
+            <w:tcW w:type="dxa" w:w="2268"/>
+            <w:shd w:fill="EAFAF1" w:val="clear"/>
+          </w:tcPr>
+          <w:p>
+            <w:r/>
+            <w:r>
+              <w:rPr>
+                <w:rFonts w:ascii="Meiryo" w:hAnsi="Meiryo"/>
+                <w:b w:val="0"/>
+                <w:sz w:val="18"/>
+              </w:rPr>
+              <w:t>検知できる ★</w:t>
+            </w:r>
+          </w:p>
+        </w:tc>
+      </w:tr>
+    </w:tbl>
+    <w:p>
+      <w:r>
+        <w:rPr>
+          <w:rFonts w:ascii="Meiryo" w:hAnsi="Meiryo"/>
+          <w:b w:val="0"/>
+          <w:sz w:val="18"/>
+        </w:rPr>
+        <w:t>■ 銀行の追加認証（電話確認）すら機能しない：被害者は犯人との電話がつながったままで銀行からの電話に出られない。出たとしても「はい、自分で送金しました」と答える（攻撃されていることに気づいていない）。</w:t>
+      </w:r>
+    </w:p>
     <w:sectPr>
       <w:pgSz w:w="11906" w:h="16838"/>
       <w:pgMar w:top="1134" w:right="1417" w:bottom="1134" w:left="1417" w:header="720" w:footer="720" w:gutter="0"/>

</xml_diff>

<commit_message>
Add real-time transfer block analysis and BEC classification
Why transfers can't be stopped in real-time (5 reasons), and how
this attack differs from BEC. Correctly classified as Vishing-origin
ATO fraud, not email compromise. Added to both Word and PowerPoint.

https://claude.ai/code/session_01F7t8LKifK43o6sCdF2a3gQ
</commit_message>
<xml_diff>
--- a/Fraud_Kill_Chain.docx
+++ b/Fraud_Kill_Chain.docx
@@ -4667,6 +4667,572 @@
         <w:t>■ 銀行の追加認証（電話確認）すら機能しない：被害者は犯人との電話がつながったままで銀行からの電話に出られない。出たとしても「はい、自分で送金しました」と答える（攻撃されていることに気づいていない）。</w:t>
       </w:r>
     </w:p>
+    <w:p>
+      <w:r>
+        <w:br w:type="page"/>
+      </w:r>
+    </w:p>
+    <w:p>
+      <w:pPr>
+        <w:pStyle w:val="Heading1"/>
+      </w:pPr>
+      <w:r>
+        <w:rPr>
+          <w:rFonts w:ascii="Meiryo" w:hAnsi="Meiryo"/>
+        </w:rPr>
+        <w:t>付録：振込を即時に止められない理由</w:t>
+      </w:r>
+    </w:p>
+    <w:p>
+      <w:r>
+        <w:rPr>
+          <w:rFonts w:ascii="Meiryo" w:hAnsi="Meiryo"/>
+          <w:b w:val="0"/>
+          <w:sz w:val="20"/>
+        </w:rPr>
+        <w:t>異常検知の信号があっても、振込そのものをリアルタイムで止めることは極めて困難。理由は複数の要因が重なっているため。</w:t>
+      </w:r>
+    </w:p>
+    <w:p>
+      <w:r>
+        <w:rPr>
+          <w:rFonts w:ascii="Meiryo" w:hAnsi="Meiryo"/>
+          <w:b/>
+          <w:sz w:val="20"/>
+        </w:rPr>
+        <w:t>理由1：振込時点では「正規の取引」と判別不能</w:t>
+      </w:r>
+    </w:p>
+    <w:p>
+      <w:r>
+        <w:rPr>
+          <w:rFonts w:ascii="Meiryo" w:hAnsi="Meiryo"/>
+          <w:b w:val="0"/>
+          <w:sz w:val="18"/>
+        </w:rPr>
+        <w:t>正しい認証情報（窃取済みだが有効）、正しいOTP（有効期限内）、本人のアカウント・いつものIP（PC経由）→「本人による正規の振込」としか見えず、止める根拠がない。</w:t>
+      </w:r>
+    </w:p>
+    <w:p>
+      <w:r>
+        <w:rPr>
+          <w:rFonts w:ascii="Meiryo" w:hAnsi="Meiryo"/>
+          <w:b/>
+          <w:sz w:val="20"/>
+        </w:rPr>
+        <w:t>理由2：振込限度額の範囲内なら自動で通る</w:t>
+      </w:r>
+    </w:p>
+    <w:p>
+      <w:r>
+        <w:rPr>
+          <w:rFonts w:ascii="Meiryo" w:hAnsi="Meiryo"/>
+          <w:b w:val="0"/>
+          <w:sz w:val="18"/>
+        </w:rPr>
+        <w:t>法人IBの振込限度額は高額に設定されている。限度額の範囲内ならシステムが自動承認し、人間のチェックが入らず数秒で送金完了。</w:t>
+      </w:r>
+    </w:p>
+    <w:p>
+      <w:r>
+        <w:rPr>
+          <w:rFonts w:ascii="Meiryo" w:hAnsi="Meiryo"/>
+          <w:b/>
+          <w:sz w:val="20"/>
+        </w:rPr>
+        <w:t>理由3：全銀システムは「即時送金」が前提</w:t>
+      </w:r>
+    </w:p>
+    <w:p>
+      <w:r>
+        <w:rPr>
+          <w:rFonts w:ascii="Meiryo" w:hAnsi="Meiryo"/>
+          <w:b w:val="0"/>
+          <w:sz w:val="18"/>
+        </w:rPr>
+        <w:t>モアタイムシステムで24時間即時着金。便利だが「ちょっと待った」ができず、着金した瞬間に引き出し可能。</w:t>
+      </w:r>
+    </w:p>
+    <w:p>
+      <w:r>
+        <w:rPr>
+          <w:rFonts w:ascii="Meiryo" w:hAnsi="Meiryo"/>
+          <w:b/>
+          <w:sz w:val="20"/>
+        </w:rPr>
+        <w:t>理由4：着金後すぐ資金が分散される（マネロン）</w:t>
+      </w:r>
+    </w:p>
+    <w:p>
+      <w:r>
+        <w:rPr>
+          <w:rFonts w:ascii="Meiryo" w:hAnsi="Meiryo"/>
+          <w:b w:val="0"/>
+          <w:sz w:val="18"/>
+        </w:rPr>
+        <w:t>出し子の口座に着金 → 即座にATM出金 / 別口座へ転送 / 暗号資産へ変換 → 数分で資金が消え、組戻し（取り消し）が間に合わない。</w:t>
+      </w:r>
+    </w:p>
+    <w:p>
+      <w:r>
+        <w:rPr>
+          <w:rFonts w:ascii="Meiryo" w:hAnsi="Meiryo"/>
+          <w:b/>
+          <w:sz w:val="20"/>
+        </w:rPr>
+        <w:t>理由5：被害者が攻撃に気づくのが遅い</w:t>
+      </w:r>
+    </w:p>
+    <w:p>
+      <w:r>
+        <w:rPr>
+          <w:rFonts w:ascii="Meiryo" w:hAnsi="Meiryo"/>
+          <w:b w:val="0"/>
+          <w:sz w:val="18"/>
+        </w:rPr>
+        <w:t>被害者は「銀行の手続きをした」と思っており、攻撃を受けたと認識していない。通報が数時間〜数日遅れ、その間に資金は完全に消える。</w:t>
+      </w:r>
+    </w:p>
+    <w:p>
+      <w:r>
+        <w:rPr>
+          <w:rFonts w:ascii="Meiryo" w:hAnsi="Meiryo"/>
+          <w:b/>
+          <w:color w:val="C0392B"/>
+          <w:sz w:val="20"/>
+        </w:rPr>
+        <w:t>「速い・高額・自動・即着金」という法人IBの利便性が、そのまま攻撃の通り道になっている。</w:t>
+      </w:r>
+    </w:p>
+    <w:p>
+      <w:r>
+        <w:rPr>
+          <w:rFonts w:ascii="Meiryo" w:hAnsi="Meiryo"/>
+          <w:b/>
+          <w:color w:val="27AE60"/>
+          <w:sz w:val="20"/>
+        </w:rPr>
+        <w:t>→ 事後に止めるのは不可能。振込の手前（手順④⑥）で止めるか、「初回送金先は着金保留」のような仕組みが必要。</w:t>
+      </w:r>
+    </w:p>
+    <w:p>
+      <w:r>
+        <w:br w:type="page"/>
+      </w:r>
+    </w:p>
+    <w:p>
+      <w:pPr>
+        <w:pStyle w:val="Heading1"/>
+      </w:pPr>
+      <w:r>
+        <w:rPr>
+          <w:rFonts w:ascii="Meiryo" w:hAnsi="Meiryo"/>
+        </w:rPr>
+        <w:t>付録：BEC（ビジネスメール詐欺）との違い</w:t>
+      </w:r>
+    </w:p>
+    <w:p>
+      <w:r>
+        <w:rPr>
+          <w:rFonts w:ascii="Meiryo" w:hAnsi="Meiryo"/>
+          <w:b w:val="0"/>
+          <w:sz w:val="20"/>
+        </w:rPr>
+        <w:t>BEC = Business Email Compromise。経営者や取引先になりすまし、メールで偽の送金指示を出す詐欺。今回のKill Chainは典型的なBECではなく、別系統の攻撃である。</w:t>
+      </w:r>
+    </w:p>
+    <w:tbl>
+      <w:tblPr>
+        <w:tblStyle w:val="TableGrid"/>
+        <w:tblW w:type="auto" w:w="0"/>
+        <w:tblLook w:firstColumn="1" w:firstRow="1" w:lastColumn="0" w:lastRow="0" w:noHBand="0" w:noVBand="1" w:val="04A0"/>
+      </w:tblPr>
+      <w:tblGrid>
+        <w:gridCol w:w="3024"/>
+        <w:gridCol w:w="3024"/>
+        <w:gridCol w:w="3024"/>
+      </w:tblGrid>
+      <w:tr>
+        <w:tc>
+          <w:tcPr>
+            <w:tcW w:type="dxa" w:w="3024"/>
+            <w:shd w:fill="222222" w:val="clear"/>
+          </w:tcPr>
+          <w:p>
+            <w:r>
+              <w:rPr>
+                <w:rFonts w:ascii="Meiryo" w:hAnsi="Meiryo"/>
+                <w:b/>
+                <w:color w:val="FFFFFF"/>
+                <w:sz w:val="16"/>
+              </w:rPr>
+              <w:t>判定軸</w:t>
+            </w:r>
+          </w:p>
+        </w:tc>
+        <w:tc>
+          <w:tcPr>
+            <w:tcW w:type="dxa" w:w="3024"/>
+            <w:shd w:fill="222222" w:val="clear"/>
+          </w:tcPr>
+          <w:p>
+            <w:r>
+              <w:rPr>
+                <w:rFonts w:ascii="Meiryo" w:hAnsi="Meiryo"/>
+                <w:b/>
+                <w:color w:val="FFFFFF"/>
+                <w:sz w:val="16"/>
+              </w:rPr>
+              <w:t>BEC（従来）</w:t>
+            </w:r>
+          </w:p>
+        </w:tc>
+        <w:tc>
+          <w:tcPr>
+            <w:tcW w:type="dxa" w:w="3024"/>
+            <w:shd w:fill="222222" w:val="clear"/>
+          </w:tcPr>
+          <w:p>
+            <w:r>
+              <w:rPr>
+                <w:rFonts w:ascii="Meiryo" w:hAnsi="Meiryo"/>
+                <w:b/>
+                <w:color w:val="FFFFFF"/>
+                <w:sz w:val="16"/>
+              </w:rPr>
+              <w:t>今回のKill Chain</w:t>
+            </w:r>
+          </w:p>
+        </w:tc>
+      </w:tr>
+      <w:tr>
+        <w:tc>
+          <w:tcPr>
+            <w:tcW w:type="dxa" w:w="3024"/>
+          </w:tcPr>
+          <w:p>
+            <w:r/>
+            <w:r>
+              <w:rPr>
+                <w:rFonts w:ascii="Meiryo" w:hAnsi="Meiryo"/>
+                <w:b w:val="0"/>
+                <w:sz w:val="18"/>
+              </w:rPr>
+              <w:t>起点</w:t>
+            </w:r>
+          </w:p>
+        </w:tc>
+        <w:tc>
+          <w:tcPr>
+            <w:tcW w:type="dxa" w:w="3024"/>
+          </w:tcPr>
+          <w:p>
+            <w:r/>
+            <w:r>
+              <w:rPr>
+                <w:rFonts w:ascii="Meiryo" w:hAnsi="Meiryo"/>
+                <w:b w:val="0"/>
+                <w:sz w:val="18"/>
+              </w:rPr>
+              <w:t>メールの侵害・なりすまし（必須）</w:t>
+            </w:r>
+          </w:p>
+        </w:tc>
+        <w:tc>
+          <w:tcPr>
+            <w:tcW w:type="dxa" w:w="3024"/>
+          </w:tcPr>
+          <w:p>
+            <w:r/>
+            <w:r>
+              <w:rPr>
+                <w:rFonts w:ascii="Meiryo" w:hAnsi="Meiryo"/>
+                <w:b w:val="0"/>
+                <w:sz w:val="18"/>
+              </w:rPr>
+              <w:t>電話（自動音声の架電）</w:t>
+            </w:r>
+          </w:p>
+        </w:tc>
+      </w:tr>
+      <w:tr>
+        <w:tc>
+          <w:tcPr>
+            <w:tcW w:type="dxa" w:w="3024"/>
+          </w:tcPr>
+          <w:p>
+            <w:r/>
+            <w:r>
+              <w:rPr>
+                <w:rFonts w:ascii="Meiryo" w:hAnsi="Meiryo"/>
+                <w:b w:val="0"/>
+                <w:sz w:val="18"/>
+              </w:rPr>
+              <w:t>主な手段</w:t>
+            </w:r>
+          </w:p>
+        </w:tc>
+        <w:tc>
+          <w:tcPr>
+            <w:tcW w:type="dxa" w:w="3024"/>
+          </w:tcPr>
+          <w:p>
+            <w:r/>
+            <w:r>
+              <w:rPr>
+                <w:rFonts w:ascii="Meiryo" w:hAnsi="Meiryo"/>
+                <w:b w:val="0"/>
+                <w:sz w:val="18"/>
+              </w:rPr>
+              <w:t>偽の送金指示メール</w:t>
+            </w:r>
+          </w:p>
+        </w:tc>
+        <w:tc>
+          <w:tcPr>
+            <w:tcW w:type="dxa" w:w="3024"/>
+          </w:tcPr>
+          <w:p>
+            <w:r/>
+            <w:r>
+              <w:rPr>
+                <w:rFonts w:ascii="Meiryo" w:hAnsi="Meiryo"/>
+                <w:b w:val="0"/>
+                <w:sz w:val="18"/>
+              </w:rPr>
+              <w:t>偽サイト＋リモート操作（ScreenConnect）</w:t>
+            </w:r>
+          </w:p>
+        </w:tc>
+      </w:tr>
+      <w:tr>
+        <w:tc>
+          <w:tcPr>
+            <w:tcW w:type="dxa" w:w="3024"/>
+          </w:tcPr>
+          <w:p>
+            <w:r/>
+            <w:r>
+              <w:rPr>
+                <w:rFonts w:ascii="Meiryo" w:hAnsi="Meiryo"/>
+                <w:b w:val="0"/>
+                <w:sz w:val="18"/>
+              </w:rPr>
+              <w:t>誰が送金するか</w:t>
+            </w:r>
+          </w:p>
+        </w:tc>
+        <w:tc>
+          <w:tcPr>
+            <w:tcW w:type="dxa" w:w="3024"/>
+          </w:tcPr>
+          <w:p>
+            <w:r/>
+            <w:r>
+              <w:rPr>
+                <w:rFonts w:ascii="Meiryo" w:hAnsi="Meiryo"/>
+                <w:b w:val="0"/>
+                <w:sz w:val="18"/>
+              </w:rPr>
+              <w:t>被害者自身が騙されて送金</w:t>
+            </w:r>
+          </w:p>
+        </w:tc>
+        <w:tc>
+          <w:tcPr>
+            <w:tcW w:type="dxa" w:w="3024"/>
+          </w:tcPr>
+          <w:p>
+            <w:r/>
+            <w:r>
+              <w:rPr>
+                <w:rFonts w:ascii="Meiryo" w:hAnsi="Meiryo"/>
+                <w:b w:val="0"/>
+                <w:sz w:val="18"/>
+              </w:rPr>
+              <w:t>犯人が遠隔操作で送金</w:t>
+            </w:r>
+          </w:p>
+        </w:tc>
+      </w:tr>
+      <w:tr>
+        <w:tc>
+          <w:tcPr>
+            <w:tcW w:type="dxa" w:w="3024"/>
+          </w:tcPr>
+          <w:p>
+            <w:r/>
+            <w:r>
+              <w:rPr>
+                <w:rFonts w:ascii="Meiryo" w:hAnsi="Meiryo"/>
+                <w:b w:val="0"/>
+                <w:sz w:val="18"/>
+              </w:rPr>
+              <w:t>認証情報</w:t>
+            </w:r>
+          </w:p>
+        </w:tc>
+        <w:tc>
+          <w:tcPr>
+            <w:tcW w:type="dxa" w:w="3024"/>
+          </w:tcPr>
+          <w:p>
+            <w:r/>
+            <w:r>
+              <w:rPr>
+                <w:rFonts w:ascii="Meiryo" w:hAnsi="Meiryo"/>
+                <w:b w:val="0"/>
+                <w:sz w:val="18"/>
+              </w:rPr>
+              <w:t>盗まない（送金を指示するだけ）</w:t>
+            </w:r>
+          </w:p>
+        </w:tc>
+        <w:tc>
+          <w:tcPr>
+            <w:tcW w:type="dxa" w:w="3024"/>
+          </w:tcPr>
+          <w:p>
+            <w:r/>
+            <w:r>
+              <w:rPr>
+                <w:rFonts w:ascii="Meiryo" w:hAnsi="Meiryo"/>
+                <w:b w:val="0"/>
+                <w:sz w:val="18"/>
+              </w:rPr>
+              <w:t>全認証情報を窃取</w:t>
+            </w:r>
+          </w:p>
+        </w:tc>
+      </w:tr>
+      <w:tr>
+        <w:tc>
+          <w:tcPr>
+            <w:tcW w:type="dxa" w:w="3024"/>
+          </w:tcPr>
+          <w:p>
+            <w:r/>
+            <w:r>
+              <w:rPr>
+                <w:rFonts w:ascii="Meiryo" w:hAnsi="Meiryo"/>
+                <w:b w:val="0"/>
+                <w:sz w:val="18"/>
+              </w:rPr>
+              <w:t>なりすまし対象</w:t>
+            </w:r>
+          </w:p>
+        </w:tc>
+        <w:tc>
+          <w:tcPr>
+            <w:tcW w:type="dxa" w:w="3024"/>
+          </w:tcPr>
+          <w:p>
+            <w:r/>
+            <w:r>
+              <w:rPr>
+                <w:rFonts w:ascii="Meiryo" w:hAnsi="Meiryo"/>
+                <w:b w:val="0"/>
+                <w:sz w:val="18"/>
+              </w:rPr>
+              <w:t>経営者・取引先</w:t>
+            </w:r>
+          </w:p>
+        </w:tc>
+        <w:tc>
+          <w:tcPr>
+            <w:tcW w:type="dxa" w:w="3024"/>
+          </w:tcPr>
+          <w:p>
+            <w:r/>
+            <w:r>
+              <w:rPr>
+                <w:rFonts w:ascii="Meiryo" w:hAnsi="Meiryo"/>
+                <w:b w:val="0"/>
+                <w:sz w:val="18"/>
+              </w:rPr>
+              <w:t>銀行</w:t>
+            </w:r>
+          </w:p>
+        </w:tc>
+      </w:tr>
+    </w:tbl>
+    <w:p>
+      <w:pPr>
+        <w:pStyle w:val="Heading2"/>
+      </w:pPr>
+      <w:r>
+        <w:rPr>
+          <w:rFonts w:ascii="Meiryo" w:hAnsi="Meiryo"/>
+        </w:rPr>
+        <w:t>今回の攻撃の正しい分類</w:t>
+      </w:r>
+    </w:p>
+    <w:p>
+      <w:r>
+        <w:rPr>
+          <w:rFonts w:ascii="Meiryo" w:hAnsi="Meiryo"/>
+          <w:b w:val="0"/>
+          <w:sz w:val="20"/>
+        </w:rPr>
+        <w:t>この攻撃は「Vishing（ボイスフィッシング）」＋「RAT（リモートアクセスツール）悪用」＋「リアルタイムフィッシング（認証情報窃取）」の複合攻撃。</w:t>
+      </w:r>
+    </w:p>
+    <w:p>
+      <w:r>
+        <w:rPr>
+          <w:rFonts w:ascii="Meiryo" w:hAnsi="Meiryo"/>
+          <w:b w:val="0"/>
+          <w:sz w:val="18"/>
+        </w:rPr>
+        <w:t>近い概念：Tech Support Scam（テクサポ詐欺）の手口を流用、Bank Helpdesk Fraud（銀行ヘルプデスク詐欺）、ATO（Account Takeover／口座乗っ取り）</w:t>
+      </w:r>
+    </w:p>
+    <w:p>
+      <w:r>
+        <w:rPr>
+          <w:rFonts w:ascii="Meiryo" w:hAnsi="Meiryo"/>
+          <w:b/>
+          <w:color w:val="C0392B"/>
+          <w:sz w:val="20"/>
+        </w:rPr>
+        <w:t>最も正確な分類：「Vishing起点のATO（口座乗っ取り）型不正送金」</w:t>
+      </w:r>
+    </w:p>
+    <w:p>
+      <w:r>
+        <w:rPr>
+          <w:rFonts w:ascii="Meiryo" w:hAnsi="Meiryo"/>
+          <w:b/>
+          <w:sz w:val="20"/>
+        </w:rPr>
+        <w:t>BECは「メールで人を騙して送金させる」。今回は「電話で人を操り、リモートで侵入し、犯人が送金する」。目的（法人の不正送金）は同じだが、手口の系統が違う。</w:t>
+      </w:r>
+    </w:p>
+    <w:p>
+      <w:pPr>
+        <w:pStyle w:val="Heading2"/>
+      </w:pPr>
+      <w:r>
+        <w:rPr>
+          <w:rFonts w:ascii="Meiryo" w:hAnsi="Meiryo"/>
+        </w:rPr>
+        <w:t>今回の攻撃がBECより厄介な点</w:t>
+      </w:r>
+    </w:p>
+    <w:p>
+      <w:r>
+        <w:rPr>
+          <w:rFonts w:ascii="Meiryo" w:hAnsi="Meiryo"/>
+          <w:b w:val="0"/>
+          <w:sz w:val="18"/>
+        </w:rPr>
+        <w:t>• BECは「送金指示を疑う」教育で一定防げる（「口座変更は電話で確認」等）</w:t>
+        <w:br/>
+        <w:t>• 今回は被害者が銀行の手続きだと信じているので、疑うきっかけがない</w:t>
+        <w:br/>
+        <w:t>• BECは人が送金するが、今回は犯人が直接送金するので止められない</w:t>
+      </w:r>
+    </w:p>
     <w:sectPr>
       <w:pgSz w:w="11906" w:h="16838"/>
       <w:pgMar w:top="1134" w:right="1417" w:bottom="1134" w:left="1417" w:header="720" w:footer="720" w:gutter="0"/>

</xml_diff>